<commit_message>
Day Kit: describe the per-learner upload lock (D-04)
TC-041, the Block 2 table, the orientation script and the intro now say that approved and pending learners are skipped and listed as not updated, instead of the whole upload being refused.

Co-Authored-By: Claude Opus 5.5 <noreply@anthropic.com>
</commit_message>
<xml_diff>
--- a/03-Testing/EduCheck_UAT_Day_Kit.docx
+++ b/03-Testing/EduCheck_UAT_Day_Kit.docx
@@ -75,7 +75,7 @@
           <w:sz w:val="20"/>
           <w:szCs w:val="20"/>
         </w:rPr>
-        <w:t xml:space="preserve">. It matches the current system: one Subject Teacher, fictitious account names, D-04 and D-05 decided by the adviser, 3-term SF10 printing, SF10 import, and web access over the hotspot.</w:t>
+        <w:t xml:space="preserve">. It matches the current system: one Subject Teacher, fictitious account names, the per-learner upload lock (D-04), the adviser's SF10 decision (D-05), 3-term SF10 printing, SF10 import, and web access over the hotspot.</w:t>
       </w:r>
     </w:p>
     <w:p>
@@ -4922,7 +4922,7 @@
                 <w:sz w:val="18"/>
                 <w:szCs w:val="18"/>
               </w:rPr>
-              <w:t xml:space="preserve">A few known limits: it works only on this local network; phone alerts arrive only while the app is open; after a record is approved, uploads for that section are locked until a revision is requested; 3-term years print as Terms 1-3 on the SF10. Any questions?</w:t>
+              <w:t xml:space="preserve">A few known limits: it works only on this local network; phone alerts arrive only while the app is open; a learner who is approved or waiting for approval is locked, so a new upload skips them until the Adviser requests a revision; 3-term years print as Terms 1-3 on the SF10. Any questions?</w:t>
             </w:r>
           </w:p>
         </w:tc>
@@ -6564,7 +6564,7 @@
                 <w:sz w:val="18"/>
                 <w:szCs w:val="18"/>
               </w:rPr>
-              <w:t xml:space="preserve">TC-041 (upload refused), TC-042 amendment on 006</w:t>
+              <w:t xml:space="preserve">TC-041 (locked learners not updated), TC-042 amendment on 006</w:t>
             </w:r>
           </w:p>
         </w:tc>
@@ -14800,7 +14800,25 @@
                 <w:sz w:val="18"/>
                 <w:szCs w:val="18"/>
               </w:rPr>
-              <w:t xml:space="preserve"> Try to upload English again: it is refused (approved learners, D-04).</w:t>
+              <w:t xml:space="preserve"> Upload English again: the rest of the class is saved; the approved and pending learners are listed as </w:t>
+            </w:r>
+            <w:r>
+              <w:rPr>
+                <w:rFonts w:ascii="Arial" w:cs="Arial" w:eastAsia="Arial" w:hAnsi="Arial"/>
+                <w:b/>
+                <w:bCs/>
+                <w:sz w:val="18"/>
+                <w:szCs w:val="18"/>
+              </w:rPr>
+              <w:t xml:space="preserve">not updated</w:t>
+            </w:r>
+            <w:r>
+              <w:rPr>
+                <w:rFonts w:ascii="Arial" w:cs="Arial" w:eastAsia="Arial" w:hAnsi="Arial"/>
+                <w:sz w:val="18"/>
+                <w:szCs w:val="18"/>
+              </w:rPr>
+              <w:t xml:space="preserve"> (D-04).</w:t>
             </w:r>
           </w:p>
         </w:tc>

</xml_diff>

<commit_message>
Remove the outdated UAT plan PDF; the Day Kit replaces it
Co-Authored-By: Claude Opus 5.5 <noreply@anthropic.com>
</commit_message>
<xml_diff>
--- a/03-Testing/EduCheck_UAT_Day_Kit.docx
+++ b/03-Testing/EduCheck_UAT_Day_Kit.docx
@@ -59,23 +59,7 @@
           <w:sz w:val="20"/>
           <w:szCs w:val="20"/>
         </w:rPr>
-        <w:t xml:space="preserve">This kit replaces the running order in </w:t>
-      </w:r>
-      <w:r>
-        <w:rPr>
-          <w:rFonts w:ascii="Consolas" w:cs="Consolas" w:eastAsia="Consolas" w:hAnsi="Consolas"/>
-          <w:sz w:val="19"/>
-          <w:szCs w:val="19"/>
-        </w:rPr>
-        <w:t xml:space="preserve">EduCheck_UAT_Plan.pdf</w:t>
-      </w:r>
-      <w:r>
-        <w:rPr>
-          <w:rFonts w:ascii="Arial" w:cs="Arial" w:eastAsia="Arial" w:hAnsi="Arial"/>
-          <w:sz w:val="20"/>
-          <w:szCs w:val="20"/>
-        </w:rPr>
-        <w:t xml:space="preserve">. It matches the current system: one Subject Teacher, fictitious account names, the per-learner upload lock (D-04), the adviser's SF10 decision (D-05), 3-term SF10 printing, SF10 import, and web access over the hotspot.</w:t>
+        <w:t xml:space="preserve">This kit replaces the earlier UAT plan (EduCheck_UAT_Plan.pdf, now removed). It matches the current system: one Subject Teacher, fictitious account names, the per-learner upload lock (D-04), the adviser's SF10 decision (D-05), 3-term SF10 printing, SF10 import, and web access over the hotspot.</w:t>
       </w:r>
     </w:p>
     <w:p>

</xml_diff>